<commit_message>
:bug: fix: ajusta paginação de usuários no frontend
</commit_message>
<xml_diff>
--- a/Documentation/WORD/Sprint14_Task128_ImplementarPaginaçãonoFrontend.docx
+++ b/Documentation/WORD/Sprint14_Task128_ImplementarPaginaçãonoFrontend.docx
@@ -1,6 +1,6 @@
 
 <file path=word/document.xml><?xml version="1.0" encoding="utf-8"?>
-<w:document xmlns:wpc="http://schemas.microsoft.com/office/word/2010/wordprocessingCanvas" xmlns:cx="http://schemas.microsoft.com/office/drawing/2014/chartex" xmlns:cx1="http://schemas.microsoft.com/office/drawing/2015/9/8/chartex" xmlns:cx2="http://schemas.microsoft.com/office/drawing/2015/10/21/chartex" xmlns:cx3="http://schemas.microsoft.com/office/drawing/2016/5/9/chartex" xmlns:cx4="http://schemas.microsoft.com/office/drawing/2016/5/10/chartex" xmlns:cx5="http://schemas.microsoft.com/office/drawing/2016/5/11/chartex" xmlns:cx6="http://schemas.microsoft.com/office/drawing/2016/5/12/chartex" xmlns:cx7="http://schemas.microsoft.com/office/drawing/2016/5/13/chartex" xmlns:cx8="http://schemas.microsoft.com/office/drawing/2016/5/14/chartex" xmlns:mc="http://schemas.openxmlformats.org/markup-compatibility/2006" xmlns:aink="http://schemas.microsoft.com/office/drawing/2016/ink" xmlns:am3d="http://schemas.microsoft.com/office/drawing/2017/model3d" xmlns:o="urn:schemas-microsoft-com:office:office" xmlns:oel="http://schemas.microsoft.com/office/2019/extlst" xmlns:r="http://schemas.openxmlformats.org/officeDocument/2006/relationships" xmlns:m="http://schemas.openxmlformats.org/officeDocument/2006/math" xmlns:v="urn:schemas-microsoft-com:vml" xmlns:wp14="http://schemas.microsoft.com/office/word/2010/wordprocessingDrawing" xmlns:wp="http://schemas.openxmlformats.org/drawingml/2006/wordprocessingDrawing" xmlns:w10="urn:schemas-microsoft-com:office:word" xmlns:w="http://schemas.openxmlformats.org/wordprocessingml/2006/main" xmlns:w14="http://schemas.microsoft.com/office/word/2010/wordml" xmlns:w15="http://schemas.microsoft.com/office/word/2012/wordml" xmlns:w16cex="http://schemas.microsoft.com/office/word/2018/wordml/cex" xmlns:w16cid="http://schemas.microsoft.com/office/word/2016/wordml/cid" xmlns:w16="http://schemas.microsoft.com/office/word/2018/wordml" xmlns:w16du="http://schemas.microsoft.com/office/word/2023/wordml/word16du" xmlns:w16sdtdh="http://schemas.microsoft.com/office/word/2020/wordml/sdtdatahash" xmlns:w16sdtfl="http://schemas.microsoft.com/office/word/2024/wordml/sdtformatlock" xmlns:w16se="http://schemas.microsoft.com/office/word/2015/wordml/symex" xmlns:wpg="http://schemas.microsoft.com/office/word/2010/wordprocessingGroup" xmlns:wpi="http://schemas.microsoft.com/office/word/2010/wordprocessingInk" xmlns:wne="http://schemas.microsoft.com/office/word/2006/wordml" xmlns:wps="http://schemas.microsoft.com/office/word/2010/wordprocessingShape" mc:Ignorable="w14 w15 w16se w16cid w16 w16cex w16sdtdh w16sdtfl w16du wp14">
+<w:document xmlns:wpc="http://schemas.microsoft.com/office/word/2010/wordprocessingCanvas" xmlns:cx="http://schemas.microsoft.com/office/drawing/2014/chartex" xmlns:cx1="http://schemas.microsoft.com/office/drawing/2015/9/8/chartex" xmlns:cx2="http://schemas.microsoft.com/office/drawing/2015/10/21/chartex" xmlns:cx3="http://schemas.microsoft.com/office/drawing/2016/5/9/chartex" xmlns:cx4="http://schemas.microsoft.com/office/drawing/2016/5/10/chartex" xmlns:cx5="http://schemas.microsoft.com/office/drawing/2016/5/11/chartex" xmlns:cx6="http://schemas.microsoft.com/office/drawing/2016/5/12/chartex" xmlns:cx7="http://schemas.microsoft.com/office/drawing/2016/5/13/chartex" xmlns:cx8="http://schemas.microsoft.com/office/drawing/2016/5/14/chartex" xmlns:mc="http://schemas.openxmlformats.org/markup-compatibility/2006" xmlns:aink="http://schemas.microsoft.com/office/drawing/2016/ink" xmlns:am3d="http://schemas.microsoft.com/office/drawing/2017/model3d" xmlns:o="urn:schemas-microsoft-com:office:office" xmlns:oel="http://schemas.microsoft.com/office/2019/extlst" xmlns:r="http://schemas.openxmlformats.org/officeDocument/2006/relationships" xmlns:m="http://schemas.openxmlformats.org/officeDocument/2006/math" xmlns:v="urn:schemas-microsoft-com:vml" xmlns:wp14="http://schemas.microsoft.com/office/word/2010/wordprocessingDrawing" xmlns:wp="http://schemas.openxmlformats.org/drawingml/2006/wordprocessingDrawing" xmlns:w10="urn:schemas-microsoft-com:office:word" xmlns:w="http://schemas.openxmlformats.org/wordprocessingml/2006/main" xmlns:w14="http://schemas.microsoft.com/office/word/2010/wordml" xmlns:w15="http://schemas.microsoft.com/office/word/2012/wordml" xmlns:w16cex="http://schemas.microsoft.com/office/word/2018/wordml/cex" xmlns:w16cid="http://schemas.microsoft.com/office/word/2016/wordml/cid" xmlns:w16="http://schemas.microsoft.com/office/word/2018/wordml" xmlns:w16sdtdh="http://schemas.microsoft.com/office/word/2020/wordml/sdtdatahash" xmlns:w16se="http://schemas.microsoft.com/office/word/2015/wordml/symex" xmlns:wpg="http://schemas.microsoft.com/office/word/2010/wordprocessingGroup" xmlns:wpi="http://schemas.microsoft.com/office/word/2010/wordprocessingInk" xmlns:wne="http://schemas.microsoft.com/office/word/2006/wordml" xmlns:wps="http://schemas.microsoft.com/office/word/2010/wordprocessingShape" mc:Ignorable="w14 w15 w16se w16cid w16 w16cex w16sdtdh wp14">
   <w:body>
     <w:p>
       <w:pPr>
@@ -104,20 +104,8 @@
                 <w:sz w:val="28"/>
                 <w:szCs w:val="28"/>
               </w:rPr>
-              <w:t xml:space="preserve">Sprint </w:t>
-            </w:r>
-            <w:proofErr w:type="spellStart"/>
-            <w:r>
-              <w:rPr>
-                <w:b/>
-                <w:bCs/>
-                <w:color w:val="FFFFFF" w:themeColor="background1"/>
-                <w:sz w:val="28"/>
-                <w:szCs w:val="28"/>
-              </w:rPr>
-              <w:t>Documentation</w:t>
-            </w:r>
-            <w:proofErr w:type="spellEnd"/>
+              <w:t>Sprint Documentation</w:t>
+            </w:r>
           </w:p>
         </w:tc>
       </w:tr>
@@ -217,37 +205,12 @@
                 <w:bCs/>
               </w:rPr>
             </w:pPr>
-            <w:proofErr w:type="spellStart"/>
             <w:r>
               <w:rPr>
                 <w:b/>
                 <w:bCs/>
               </w:rPr>
-              <w:t>Projetc</w:t>
-            </w:r>
-            <w:proofErr w:type="spellEnd"/>
-            <w:r>
-              <w:rPr>
-                <w:b/>
-                <w:bCs/>
-              </w:rPr>
-              <w:t xml:space="preserve"> </w:t>
-            </w:r>
-            <w:proofErr w:type="spellStart"/>
-            <w:r>
-              <w:rPr>
-                <w:b/>
-                <w:bCs/>
-              </w:rPr>
-              <w:t>Name</w:t>
-            </w:r>
-            <w:proofErr w:type="spellEnd"/>
-            <w:r>
-              <w:rPr>
-                <w:b/>
-                <w:bCs/>
-              </w:rPr>
-              <w:t>:</w:t>
+              <w:t>Projetc Name:</w:t>
             </w:r>
           </w:p>
         </w:tc>
@@ -263,7 +226,6 @@
                 <w:bCs/>
               </w:rPr>
             </w:pPr>
-            <w:proofErr w:type="spellStart"/>
             <w:r>
               <w:rPr>
                 <w:b/>
@@ -271,7 +233,6 @@
               </w:rPr>
               <w:t>Civitas-frontend</w:t>
             </w:r>
-            <w:proofErr w:type="spellEnd"/>
           </w:p>
         </w:tc>
       </w:tr>
@@ -339,18 +300,8 @@
                 <w:bCs/>
                 <w:color w:val="FFFFFF" w:themeColor="background1"/>
               </w:rPr>
-              <w:t xml:space="preserve">Team </w:t>
-            </w:r>
-            <w:proofErr w:type="spellStart"/>
-            <w:r>
-              <w:rPr>
-                <w:b/>
-                <w:bCs/>
-                <w:color w:val="FFFFFF" w:themeColor="background1"/>
-              </w:rPr>
-              <w:t>Members</w:t>
-            </w:r>
-            <w:proofErr w:type="spellEnd"/>
+              <w:t>Team Members</w:t>
+            </w:r>
           </w:p>
         </w:tc>
       </w:tr>
@@ -374,13 +325,8 @@
             <w:gridSpan w:val="4"/>
           </w:tcPr>
           <w:p>
-            <w:proofErr w:type="spellStart"/>
-            <w:r>
-              <w:t>Adryan</w:t>
-            </w:r>
-            <w:proofErr w:type="spellEnd"/>
-            <w:r>
-              <w:t xml:space="preserve"> Thiago de Oliveira Francisco</w:t>
+            <w:r>
+              <w:t>Adryan Thiago de Oliveira Francisco</w:t>
             </w:r>
           </w:p>
         </w:tc>
@@ -440,11 +386,9 @@
             <w:tcW w:w="6234" w:type="dxa"/>
           </w:tcPr>
           <w:p>
-            <w:proofErr w:type="spellStart"/>
             <w:r>
               <w:t>Description</w:t>
             </w:r>
-            <w:proofErr w:type="spellEnd"/>
           </w:p>
         </w:tc>
         <w:tc>
@@ -485,13 +429,8 @@
           </w:tcPr>
           <w:p>
             <w:r>
-              <w:t xml:space="preserve">Implementar Paginação no </w:t>
-            </w:r>
-            <w:proofErr w:type="spellStart"/>
-            <w:r>
-              <w:t>Frontend</w:t>
-            </w:r>
-            <w:proofErr w:type="spellEnd"/>
+              <w:t>Implementar Paginação no Frontend</w:t>
+            </w:r>
           </w:p>
           <w:p/>
         </w:tc>
@@ -552,17 +491,8 @@
                 <w:b/>
                 <w:bCs/>
               </w:rPr>
-              <w:t xml:space="preserve">Task </w:t>
-            </w:r>
-            <w:proofErr w:type="spellStart"/>
-            <w:r>
-              <w:rPr>
-                <w:b/>
-                <w:bCs/>
-              </w:rPr>
-              <w:t>Description</w:t>
-            </w:r>
-            <w:proofErr w:type="spellEnd"/>
+              <w:t>Task Description</w:t>
+            </w:r>
           </w:p>
         </w:tc>
       </w:tr>
@@ -582,11 +512,9 @@
             <w:tcW w:w="2971" w:type="dxa"/>
           </w:tcPr>
           <w:p>
-            <w:proofErr w:type="spellStart"/>
             <w:r>
               <w:t>Description</w:t>
             </w:r>
-            <w:proofErr w:type="spellEnd"/>
           </w:p>
         </w:tc>
         <w:tc>
@@ -594,19 +522,9 @@
             <w:tcW w:w="1441" w:type="dxa"/>
           </w:tcPr>
           <w:p>
-            <w:proofErr w:type="spellStart"/>
-            <w:r>
-              <w:t>Assigned</w:t>
-            </w:r>
-            <w:proofErr w:type="spellEnd"/>
-            <w:r>
-              <w:t xml:space="preserve"> </w:t>
-            </w:r>
-            <w:proofErr w:type="spellStart"/>
-            <w:r>
-              <w:t>To</w:t>
-            </w:r>
-            <w:proofErr w:type="spellEnd"/>
+            <w:r>
+              <w:t>Assigned To</w:t>
+            </w:r>
           </w:p>
         </w:tc>
         <w:tc>
@@ -624,13 +542,8 @@
             <w:tcW w:w="1842" w:type="dxa"/>
           </w:tcPr>
           <w:p>
-            <w:proofErr w:type="spellStart"/>
-            <w:r>
-              <w:t>Estimated</w:t>
-            </w:r>
-            <w:proofErr w:type="spellEnd"/>
-            <w:r>
-              <w:t xml:space="preserve"> Hours</w:t>
+            <w:r>
+              <w:t>Estimated Hours</w:t>
             </w:r>
           </w:p>
         </w:tc>
@@ -639,13 +552,8 @@
             <w:tcW w:w="1683" w:type="dxa"/>
           </w:tcPr>
           <w:p>
-            <w:proofErr w:type="spellStart"/>
-            <w:r>
-              <w:t>Logged</w:t>
-            </w:r>
-            <w:proofErr w:type="spellEnd"/>
-            <w:r>
-              <w:t xml:space="preserve"> Hours</w:t>
+            <w:r>
+              <w:t>Logged Hours</w:t>
             </w:r>
           </w:p>
         </w:tc>
@@ -667,39 +575,7 @@
           </w:tcPr>
           <w:p>
             <w:r>
-              <w:t xml:space="preserve">Centralizar a lógica de paginação no </w:t>
-            </w:r>
-            <w:proofErr w:type="spellStart"/>
-            <w:r>
-              <w:t>frontend</w:t>
-            </w:r>
-            <w:proofErr w:type="spellEnd"/>
-            <w:r>
-              <w:t xml:space="preserve"> de forma reutilizável, aplicando no </w:t>
-            </w:r>
-            <w:proofErr w:type="spellStart"/>
-            <w:r>
-              <w:t>GenericService</w:t>
-            </w:r>
-            <w:proofErr w:type="spellEnd"/>
-            <w:r>
-              <w:t> e no componente </w:t>
-            </w:r>
-            <w:proofErr w:type="spellStart"/>
-            <w:r>
-              <w:t>Table</w:t>
-            </w:r>
-            <w:proofErr w:type="spellEnd"/>
-            <w:r>
-              <w:t xml:space="preserve">, com opção de ativar/desativar paginação por uma única </w:t>
-            </w:r>
-            <w:proofErr w:type="spellStart"/>
-            <w:r>
-              <w:t>prop</w:t>
-            </w:r>
-            <w:proofErr w:type="spellEnd"/>
-            <w:r>
-              <w:t>.</w:t>
+              <w:t>Centralizar a lógica de paginação no frontend de forma reutilizável, aplicando no GenericService e no componente Table, com opção de ativar/desativar paginação por uma única prop.</w:t>
             </w:r>
           </w:p>
         </w:tc>
@@ -711,13 +587,8 @@
             <w:r>
               <w:t xml:space="preserve">Arthur Pires da Costa, </w:t>
             </w:r>
-            <w:proofErr w:type="spellStart"/>
-            <w:r>
-              <w:t>Adryan</w:t>
-            </w:r>
-            <w:proofErr w:type="spellEnd"/>
-            <w:r>
-              <w:t xml:space="preserve"> Thiago de Oliveira Francisco</w:t>
+            <w:r>
+              <w:t>Adryan Thiago de Oliveira Francisco</w:t>
             </w:r>
           </w:p>
         </w:tc>
@@ -776,7 +647,6 @@
         </w:rPr>
         <w:t xml:space="preserve">Sprint </w:t>
       </w:r>
-      <w:proofErr w:type="spellStart"/>
       <w:r>
         <w:rPr>
           <w:b/>
@@ -787,7 +657,6 @@
         </w:rPr>
         <w:t>Description</w:t>
       </w:r>
-      <w:proofErr w:type="spellEnd"/>
     </w:p>
     <w:p>
       <w:pPr>
@@ -809,39 +678,7 @@
           <w:b/>
           <w:bCs/>
         </w:rPr>
-        <w:t xml:space="preserve"> Tarefa: Sprint 14 - Front - Implementar paginação genérica e opcional (</w:t>
-      </w:r>
-      <w:proofErr w:type="spellStart"/>
-      <w:r>
-        <w:rPr>
-          <w:b/>
-          <w:bCs/>
-        </w:rPr>
-        <w:t>Generic</w:t>
-      </w:r>
-      <w:proofErr w:type="spellEnd"/>
-      <w:r>
-        <w:rPr>
-          <w:b/>
-          <w:bCs/>
-        </w:rPr>
-        <w:t xml:space="preserve"> Service + </w:t>
-      </w:r>
-      <w:proofErr w:type="spellStart"/>
-      <w:r>
-        <w:rPr>
-          <w:b/>
-          <w:bCs/>
-        </w:rPr>
-        <w:t>Table</w:t>
-      </w:r>
-      <w:proofErr w:type="spellEnd"/>
-      <w:r>
-        <w:rPr>
-          <w:b/>
-          <w:bCs/>
-        </w:rPr>
-        <w:t>)</w:t>
+        <w:t xml:space="preserve"> Tarefa: Sprint 14 - Front - Implementar paginação genérica e opcional (Generic Service + Table)</w:t>
       </w:r>
     </w:p>
     <w:p>
@@ -869,39 +706,7 @@
     </w:p>
     <w:p>
       <w:r>
-        <w:t xml:space="preserve">Centralizar a lógica de paginação no </w:t>
-      </w:r>
-      <w:proofErr w:type="spellStart"/>
-      <w:r>
-        <w:t>frontend</w:t>
-      </w:r>
-      <w:proofErr w:type="spellEnd"/>
-      <w:r>
-        <w:t xml:space="preserve"> de forma reutilizável, aplicando no </w:t>
-      </w:r>
-      <w:proofErr w:type="spellStart"/>
-      <w:r>
-        <w:t>GenericService</w:t>
-      </w:r>
-      <w:proofErr w:type="spellEnd"/>
-      <w:r>
-        <w:t> e no componente </w:t>
-      </w:r>
-      <w:proofErr w:type="spellStart"/>
-      <w:r>
-        <w:t>Table</w:t>
-      </w:r>
-      <w:proofErr w:type="spellEnd"/>
-      <w:r>
-        <w:t xml:space="preserve">, com opção de ativar/desativar paginação por uma única </w:t>
-      </w:r>
-      <w:proofErr w:type="spellStart"/>
-      <w:r>
-        <w:t>prop</w:t>
-      </w:r>
-      <w:proofErr w:type="spellEnd"/>
-      <w:r>
-        <w:t>.</w:t>
+        <w:t>Centralizar a lógica de paginação no frontend de forma reutilizável, aplicando no GenericService e no componente Table, com opção de ativar/desativar paginação por uma única prop.</w:t>
       </w:r>
     </w:p>
     <w:p>
@@ -935,60 +740,12 @@
         </w:numPr>
       </w:pPr>
       <w:r>
-        <w:t>Refatorar o </w:t>
-      </w:r>
-      <w:proofErr w:type="spellStart"/>
-      <w:r>
-        <w:t>GenericService</w:t>
-      </w:r>
-      <w:proofErr w:type="spellEnd"/>
-      <w:r>
-        <w:t> para suportar paginação genérica (ex.: </w:t>
-      </w:r>
-      <w:proofErr w:type="spellStart"/>
-      <w:r>
-        <w:t>page</w:t>
-      </w:r>
-      <w:proofErr w:type="spellEnd"/>
-      <w:r>
-        <w:t>, </w:t>
-      </w:r>
-      <w:proofErr w:type="spellStart"/>
-      <w:r>
-        <w:t>size</w:t>
-      </w:r>
-      <w:proofErr w:type="spellEnd"/>
-      <w:r>
-        <w:t>, metadados) sem quebrar telas existentes.</w:t>
-      </w:r>
-    </w:p>
-    <w:p>
-      <w:r>
-        <w:t>Atualizar </w:t>
-      </w:r>
-      <w:proofErr w:type="spellStart"/>
-      <w:r>
-        <w:t>Table</w:t>
-      </w:r>
-      <w:proofErr w:type="spellEnd"/>
-      <w:r>
-        <w:t xml:space="preserve"> para receber uma </w:t>
-      </w:r>
-      <w:proofErr w:type="spellStart"/>
-      <w:r>
-        <w:t>prop</w:t>
-      </w:r>
-      <w:proofErr w:type="spellEnd"/>
-      <w:r>
-        <w:t xml:space="preserve"> de controle de paginação (ex.: </w:t>
-      </w:r>
-      <w:proofErr w:type="spellStart"/>
-      <w:r>
-        <w:t>paginationEnabled</w:t>
-      </w:r>
-      <w:proofErr w:type="spellEnd"/>
-      <w:r>
-        <w:t>) e funcionar tanto paginado quanto não paginado.</w:t>
+        <w:t>Refatorar o GenericService para suportar paginação genérica (ex.: page, size, metadados) sem quebrar telas existentes.</w:t>
+      </w:r>
+    </w:p>
+    <w:p>
+      <w:r>
+        <w:t>Atualizar Table para receber uma prop de controle de paginação (ex.: paginationEnabled) e funcionar tanto paginado quanto não paginado.</w:t>
       </w:r>
     </w:p>
     <w:p>
@@ -1003,23 +760,7 @@
     </w:p>
     <w:p>
       <w:r>
-        <w:t>Garantir tipagem consistente (</w:t>
-      </w:r>
-      <w:proofErr w:type="spellStart"/>
-      <w:r>
-        <w:t>TypeScript</w:t>
-      </w:r>
-      <w:proofErr w:type="spellEnd"/>
-      <w:r>
-        <w:t xml:space="preserve">) e compatibilidade com o contrato de paginação do </w:t>
-      </w:r>
-      <w:proofErr w:type="spellStart"/>
-      <w:r>
-        <w:t>backend</w:t>
-      </w:r>
-      <w:proofErr w:type="spellEnd"/>
-      <w:r>
-        <w:t>.</w:t>
+        <w:t>Garantir tipagem consistente (TypeScript) e compatibilidade com o contrato de paginação do backend.</w:t>
       </w:r>
     </w:p>
     <w:p>
@@ -1066,15 +807,7 @@
         <w:t>Pessoa 1:</w:t>
       </w:r>
       <w:r>
-        <w:t> implementa base genérica no </w:t>
-      </w:r>
-      <w:proofErr w:type="spellStart"/>
-      <w:r>
-        <w:t>GenericService</w:t>
-      </w:r>
-      <w:proofErr w:type="spellEnd"/>
-      <w:r>
-        <w:t> + tipos/interfaces de paginação.</w:t>
+        <w:t> implementa base genérica no GenericService + tipos/interfaces de paginação.</w:t>
       </w:r>
     </w:p>
     <w:p>
@@ -1092,15 +825,7 @@
         <w:t>Pessoa 2:</w:t>
       </w:r>
       <w:r>
-        <w:t> implementa comportamento opcional no </w:t>
-      </w:r>
-      <w:proofErr w:type="spellStart"/>
-      <w:r>
-        <w:t>Table</w:t>
-      </w:r>
-      <w:proofErr w:type="spellEnd"/>
-      <w:r>
-        <w:t> + integração e validação em telas reais.</w:t>
+        <w:t> implementa comportamento opcional no Table + integração e validação em telas reais.</w:t>
       </w:r>
     </w:p>
     <w:tbl>
@@ -1136,20 +861,8 @@
                 <w:sz w:val="24"/>
                 <w:szCs w:val="24"/>
               </w:rPr>
-              <w:t xml:space="preserve">Sprint </w:t>
-            </w:r>
-            <w:proofErr w:type="spellStart"/>
-            <w:r>
-              <w:rPr>
-                <w:b/>
-                <w:bCs/>
-                <w:color w:val="FFFFFF" w:themeColor="background1"/>
-                <w:sz w:val="24"/>
-                <w:szCs w:val="24"/>
-              </w:rPr>
-              <w:t>Results</w:t>
-            </w:r>
-            <w:proofErr w:type="spellEnd"/>
+              <w:t>Sprint Results</w:t>
+            </w:r>
           </w:p>
         </w:tc>
       </w:tr>
@@ -1157,146 +870,12 @@
     <w:p/>
     <w:p>
       <w:r>
-        <w:t>No `</w:t>
-      </w:r>
-      <w:proofErr w:type="spellStart"/>
-      <w:r>
-        <w:t>GenericService</w:t>
-      </w:r>
-      <w:proofErr w:type="spellEnd"/>
-      <w:r>
-        <w:t>`, centraliz</w:t>
-      </w:r>
-      <w:r>
-        <w:t>amos</w:t>
-      </w:r>
-      <w:r>
-        <w:t xml:space="preserve"> o tratamento de respostas paginadas com tipagem consistente, incluindo suporte a `</w:t>
-      </w:r>
-      <w:proofErr w:type="spellStart"/>
-      <w:r>
-        <w:t>page</w:t>
-      </w:r>
-      <w:proofErr w:type="spellEnd"/>
-      <w:r>
-        <w:t>`, `</w:t>
-      </w:r>
-      <w:proofErr w:type="spellStart"/>
-      <w:r>
-        <w:t>size</w:t>
-      </w:r>
-      <w:proofErr w:type="spellEnd"/>
-      <w:r>
-        <w:t>` e metadados de paginação, além dos métodos `</w:t>
-      </w:r>
-      <w:proofErr w:type="spellStart"/>
-      <w:proofErr w:type="gramStart"/>
-      <w:r>
-        <w:t>getPage</w:t>
-      </w:r>
-      <w:proofErr w:type="spellEnd"/>
-      <w:r>
-        <w:t>(</w:t>
-      </w:r>
-      <w:proofErr w:type="gramEnd"/>
-      <w:r>
-        <w:t>)` e `</w:t>
-      </w:r>
-      <w:proofErr w:type="spellStart"/>
-      <w:proofErr w:type="gramStart"/>
-      <w:r>
-        <w:t>getPageData</w:t>
-      </w:r>
-      <w:proofErr w:type="spellEnd"/>
-      <w:r>
-        <w:t>(</w:t>
-      </w:r>
-      <w:proofErr w:type="gramEnd"/>
-      <w:r>
-        <w:t>)` para consumo paginado. Também preser</w:t>
-      </w:r>
-      <w:r>
-        <w:t>vamos</w:t>
-      </w:r>
-      <w:r>
-        <w:t xml:space="preserve"> a compatibilidade com telas legadas: `</w:t>
-      </w:r>
-      <w:proofErr w:type="spellStart"/>
-      <w:proofErr w:type="gramStart"/>
-      <w:r>
-        <w:t>getAll</w:t>
-      </w:r>
-      <w:proofErr w:type="spellEnd"/>
-      <w:r>
-        <w:t>(</w:t>
-      </w:r>
-      <w:proofErr w:type="gramEnd"/>
-      <w:r>
-        <w:t>)` e `</w:t>
-      </w:r>
-      <w:proofErr w:type="spellStart"/>
-      <w:proofErr w:type="gramStart"/>
-      <w:r>
-        <w:t>getAllData</w:t>
-      </w:r>
-      <w:proofErr w:type="spellEnd"/>
-      <w:r>
-        <w:t>(</w:t>
-      </w:r>
-      <w:proofErr w:type="gramEnd"/>
-      <w:r>
-        <w:t xml:space="preserve">)` continuam retornando </w:t>
-      </w:r>
-      <w:proofErr w:type="spellStart"/>
-      <w:r>
-        <w:t>arrays</w:t>
-      </w:r>
-      <w:proofErr w:type="spellEnd"/>
-      <w:r>
-        <w:t xml:space="preserve"> completos, agregando todas as páginas quando o </w:t>
-      </w:r>
-      <w:proofErr w:type="spellStart"/>
-      <w:r>
-        <w:t>backend</w:t>
-      </w:r>
-      <w:proofErr w:type="spellEnd"/>
-      <w:r>
-        <w:t xml:space="preserve"> responde em formato paginado.</w:t>
-      </w:r>
-    </w:p>
-    <w:p>
-      <w:r>
-        <w:t>No componente `</w:t>
-      </w:r>
-      <w:proofErr w:type="spellStart"/>
-      <w:r>
-        <w:t>Table</w:t>
-      </w:r>
-      <w:proofErr w:type="spellEnd"/>
-      <w:r>
-        <w:t>`, adicion</w:t>
-      </w:r>
-      <w:r>
-        <w:t>amos</w:t>
-      </w:r>
-      <w:r>
-        <w:t xml:space="preserve"> suporte genérico a paginação opcional por meio da </w:t>
-      </w:r>
-      <w:proofErr w:type="spellStart"/>
-      <w:r>
-        <w:t>prop</w:t>
-      </w:r>
-      <w:proofErr w:type="spellEnd"/>
-      <w:r>
-        <w:t xml:space="preserve"> `</w:t>
-      </w:r>
-      <w:proofErr w:type="spellStart"/>
-      <w:r>
-        <w:t>paginationEnabled</w:t>
-      </w:r>
-      <w:proofErr w:type="spellEnd"/>
-      <w:r>
-        <w:t>`. Quando ativada, a tabela renderiza indicador de página atual, navegação anterior/próxima e seletor de tamanho de página. Quando desativada, mantém o comportamento anterior sem dependência dos controles.</w:t>
+        <w:t>No GenericService, centralizamos o tratamento de respostas paginadas com tipagem consistente, incluindo suporte a page, size e metadados de paginação, além dos métodos getPage() e getPageData() para consumo paginado. Também preservamos a compatibilidade com telas legadas: getAll() e getAllData() continuam retornando arrays completos, agregando todas as páginas quando o backend responde em formato paginado.</w:t>
+      </w:r>
+    </w:p>
+    <w:p>
+      <w:r>
+        <w:t>No componente Table, adicionamos suporte genérico a paginação opcional por meio da prop paginationEnabled. Quando ativada, a tabela renderiza indicador de página atual, navegação anterior/próxima e seletor de tamanho de página. Quando desativada, mantém o comportamento anterior sem dependência dos controles.</w:t>
       </w:r>
     </w:p>
     <w:p>
@@ -1316,28 +895,12 @@
     </w:p>
     <w:p>
       <w:r>
-        <w:t>- `fornecedor`, com paginação ativa, navegação entre páginas e tratamento correto de erro de carregamento</w:t>
-      </w:r>
-    </w:p>
-    <w:p>
-      <w:r>
-        <w:t>- `</w:t>
-      </w:r>
-      <w:proofErr w:type="spellStart"/>
-      <w:r>
-        <w:t>instituicoes</w:t>
-      </w:r>
-      <w:proofErr w:type="spellEnd"/>
-      <w:r>
-        <w:t>`, com `</w:t>
-      </w:r>
-      <w:proofErr w:type="spellStart"/>
-      <w:r>
-        <w:t>paginationEnabled</w:t>
-      </w:r>
-      <w:proofErr w:type="spellEnd"/>
-      <w:r>
-        <w:t>={false}` para validar o fluxo sem paginação</w:t>
+        <w:t>- fornecedor, com paginação ativa, navegação entre páginas e tratamento correto de erro de carregamento</w:t>
+      </w:r>
+    </w:p>
+    <w:p>
+      <w:r>
+        <w:t>- instituicoes, com paginationEnabled={false} para validar o fluxo sem paginação</w:t>
       </w:r>
     </w:p>
     <w:p>
@@ -1352,156 +915,50 @@
           <w:b/>
           <w:bCs/>
         </w:rPr>
-        <w:t xml:space="preserve">Validação concluída no </w:t>
-      </w:r>
-      <w:proofErr w:type="spellStart"/>
+        <w:t>Validação concluída no frontend:</w:t>
+      </w:r>
+    </w:p>
+    <w:p>
+      <w:r>
+        <w:t>- npm run build</w:t>
+      </w:r>
+    </w:p>
+    <w:p>
+      <w:r>
+        <w:t>- npx tsc --noEmit</w:t>
+      </w:r>
+    </w:p>
+    <w:p>
+      <w:r>
+        <w:t>- validação visual da paginação ativa em fornecedor</w:t>
+      </w:r>
+    </w:p>
+    <w:p>
+      <w:r>
+        <w:t>- validação visual do fluxo sem paginação em instituicoes</w:t>
+      </w:r>
+    </w:p>
+    <w:p>
+      <w:r>
+        <w:t>- validação do banner de erro em fornecedor</w:t>
+      </w:r>
+    </w:p>
+    <w:p>
+      <w:r>
+        <w:t>- validação de coleção paginada com mais de 100 registros no fluxo de getAll(), sem truncamento</w:t>
+      </w:r>
+    </w:p>
+    <w:p>
       <w:r>
         <w:rPr>
-          <w:b/>
-          <w:bCs/>
+          <w:noProof/>
         </w:rPr>
-        <w:t>frontend</w:t>
-      </w:r>
-      <w:proofErr w:type="spellEnd"/>
-      <w:r>
-        <w:rPr>
-          <w:b/>
-          <w:bCs/>
-        </w:rPr>
-        <w:t>:</w:t>
-      </w:r>
-    </w:p>
-    <w:p>
-      <w:r>
-        <w:t>- `</w:t>
-      </w:r>
-      <w:proofErr w:type="spellStart"/>
-      <w:r>
-        <w:t>npm</w:t>
-      </w:r>
-      <w:proofErr w:type="spellEnd"/>
-      <w:r>
-        <w:t xml:space="preserve"> </w:t>
-      </w:r>
-      <w:proofErr w:type="spellStart"/>
-      <w:r>
-        <w:t>run</w:t>
-      </w:r>
-      <w:proofErr w:type="spellEnd"/>
-      <w:r>
-        <w:t xml:space="preserve"> build`</w:t>
-      </w:r>
-    </w:p>
-    <w:p>
-      <w:r>
-        <w:t>- `</w:t>
-      </w:r>
-      <w:proofErr w:type="spellStart"/>
-      <w:r>
-        <w:t>npx</w:t>
-      </w:r>
-      <w:proofErr w:type="spellEnd"/>
-      <w:r>
-        <w:t xml:space="preserve"> </w:t>
-      </w:r>
-      <w:proofErr w:type="spellStart"/>
-      <w:r>
-        <w:t>tsc</w:t>
-      </w:r>
-      <w:proofErr w:type="spellEnd"/>
-      <w:r>
-        <w:t xml:space="preserve"> --</w:t>
-      </w:r>
-      <w:proofErr w:type="spellStart"/>
-      <w:r>
-        <w:t>noEmit</w:t>
-      </w:r>
-      <w:proofErr w:type="spellEnd"/>
-      <w:r>
-        <w:t>`</w:t>
-      </w:r>
-    </w:p>
-    <w:p>
-      <w:r>
-        <w:t xml:space="preserve">- </w:t>
-      </w:r>
-      <w:proofErr w:type="gramStart"/>
-      <w:r>
-        <w:t>validação</w:t>
-      </w:r>
-      <w:proofErr w:type="gramEnd"/>
-      <w:r>
-        <w:t xml:space="preserve"> visual da paginação ativa em `fornecedor`</w:t>
-      </w:r>
-    </w:p>
-    <w:p>
-      <w:r>
-        <w:t xml:space="preserve">- </w:t>
-      </w:r>
-      <w:proofErr w:type="gramStart"/>
-      <w:r>
-        <w:t>validação</w:t>
-      </w:r>
-      <w:proofErr w:type="gramEnd"/>
-      <w:r>
-        <w:t xml:space="preserve"> visual do fluxo sem paginação em `</w:t>
-      </w:r>
-      <w:proofErr w:type="spellStart"/>
-      <w:r>
-        <w:t>instituicoes</w:t>
-      </w:r>
-      <w:proofErr w:type="spellEnd"/>
-      <w:r>
-        <w:t>`</w:t>
-      </w:r>
-    </w:p>
-    <w:p>
-      <w:r>
-        <w:t xml:space="preserve">- </w:t>
-      </w:r>
-      <w:proofErr w:type="gramStart"/>
-      <w:r>
-        <w:t>validação</w:t>
-      </w:r>
-      <w:proofErr w:type="gramEnd"/>
-      <w:r>
-        <w:t xml:space="preserve"> do banner de erro em `fornecedor`</w:t>
-      </w:r>
-    </w:p>
-    <w:p>
-      <w:r>
-        <w:t xml:space="preserve">- </w:t>
-      </w:r>
-      <w:proofErr w:type="gramStart"/>
-      <w:r>
-        <w:t>validação</w:t>
-      </w:r>
-      <w:proofErr w:type="gramEnd"/>
-      <w:r>
-        <w:t xml:space="preserve"> de coleção paginada com mais de 100 registros no fluxo de `</w:t>
-      </w:r>
-      <w:proofErr w:type="spellStart"/>
-      <w:proofErr w:type="gramStart"/>
-      <w:r>
-        <w:t>getAll</w:t>
-      </w:r>
-      <w:proofErr w:type="spellEnd"/>
-      <w:r>
-        <w:t>(</w:t>
-      </w:r>
-      <w:proofErr w:type="gramEnd"/>
-      <w:r>
-        <w:t>)`, sem truncamento</w:t>
-      </w:r>
-    </w:p>
-    <w:p>
-      <w:r>
         <w:lastRenderedPageBreak/>
         <w:drawing>
-          <wp:inline distT="0" distB="0" distL="0" distR="0" wp14:anchorId="1FF0345C" wp14:editId="012B977E">
-            <wp:extent cx="6472555" cy="5193665"/>
-            <wp:effectExtent l="0" t="0" r="4445" b="6985"/>
-            <wp:docPr id="109888469" name="Imagem 1"/>
+          <wp:inline distT="0" distB="0" distL="0" distR="0" wp14:anchorId="72927179" wp14:editId="2F814351">
+            <wp:extent cx="6472555" cy="4854575"/>
+            <wp:effectExtent l="0" t="0" r="4445" b="3175"/>
+            <wp:docPr id="1" name="Imagem 1"/>
             <wp:cNvGraphicFramePr>
               <a:graphicFrameLocks xmlns:a="http://schemas.openxmlformats.org/drawingml/2006/main" noChangeAspect="1"/>
             </wp:cNvGraphicFramePr>
@@ -1509,23 +966,36 @@
               <a:graphicData uri="http://schemas.openxmlformats.org/drawingml/2006/picture">
                 <pic:pic xmlns:pic="http://schemas.openxmlformats.org/drawingml/2006/picture">
                   <pic:nvPicPr>
-                    <pic:cNvPr id="109888469" name=""/>
-                    <pic:cNvPicPr/>
+                    <pic:cNvPr id="0" name="Picture 1"/>
+                    <pic:cNvPicPr>
+                      <a:picLocks noChangeAspect="1" noChangeArrowheads="1"/>
+                    </pic:cNvPicPr>
                   </pic:nvPicPr>
                   <pic:blipFill>
-                    <a:blip r:embed="rId8"/>
+                    <a:blip r:embed="rId8" cstate="print">
+                      <a:extLst>
+                        <a:ext uri="{28A0092B-C50C-407E-A947-70E740481C1C}">
+                          <a14:useLocalDpi xmlns:a14="http://schemas.microsoft.com/office/drawing/2010/main" val="0"/>
+                        </a:ext>
+                      </a:extLst>
+                    </a:blip>
+                    <a:srcRect/>
                     <a:stretch>
                       <a:fillRect/>
                     </a:stretch>
                   </pic:blipFill>
-                  <pic:spPr>
+                  <pic:spPr bwMode="auto">
                     <a:xfrm>
                       <a:off x="0" y="0"/>
-                      <a:ext cx="6472555" cy="5193665"/>
+                      <a:ext cx="6472555" cy="4854575"/>
                     </a:xfrm>
                     <a:prstGeom prst="rect">
                       <a:avLst/>
                     </a:prstGeom>
+                    <a:noFill/>
+                    <a:ln>
+                      <a:noFill/>
+                    </a:ln>
                   </pic:spPr>
                 </pic:pic>
               </a:graphicData>
@@ -1533,16 +1003,18 @@
           </wp:inline>
         </w:drawing>
       </w:r>
-      <w:r>
-        <w:br/>
-      </w:r>
-      <w:r>
+    </w:p>
+    <w:p>
+      <w:r>
+        <w:rPr>
+          <w:noProof/>
+        </w:rPr>
         <w:lastRenderedPageBreak/>
         <w:drawing>
-          <wp:inline distT="0" distB="0" distL="0" distR="0" wp14:anchorId="5D86D28C" wp14:editId="420F0C13">
-            <wp:extent cx="6472555" cy="5263515"/>
-            <wp:effectExtent l="0" t="0" r="4445" b="0"/>
-            <wp:docPr id="1041903296" name="Imagem 1"/>
+          <wp:inline distT="0" distB="0" distL="0" distR="0" wp14:anchorId="4426F6E6" wp14:editId="6141AC71">
+            <wp:extent cx="6472555" cy="7863840"/>
+            <wp:effectExtent l="0" t="0" r="4445" b="3810"/>
+            <wp:docPr id="2" name="Imagem 2"/>
             <wp:cNvGraphicFramePr>
               <a:graphicFrameLocks xmlns:a="http://schemas.openxmlformats.org/drawingml/2006/main" noChangeAspect="1"/>
             </wp:cNvGraphicFramePr>
@@ -1550,23 +1022,36 @@
               <a:graphicData uri="http://schemas.openxmlformats.org/drawingml/2006/picture">
                 <pic:pic xmlns:pic="http://schemas.openxmlformats.org/drawingml/2006/picture">
                   <pic:nvPicPr>
-                    <pic:cNvPr id="1041903296" name=""/>
-                    <pic:cNvPicPr/>
+                    <pic:cNvPr id="0" name="Picture 3"/>
+                    <pic:cNvPicPr>
+                      <a:picLocks noChangeAspect="1" noChangeArrowheads="1"/>
+                    </pic:cNvPicPr>
                   </pic:nvPicPr>
                   <pic:blipFill>
-                    <a:blip r:embed="rId9"/>
+                    <a:blip r:embed="rId9" cstate="print">
+                      <a:extLst>
+                        <a:ext uri="{28A0092B-C50C-407E-A947-70E740481C1C}">
+                          <a14:useLocalDpi xmlns:a14="http://schemas.microsoft.com/office/drawing/2010/main" val="0"/>
+                        </a:ext>
+                      </a:extLst>
+                    </a:blip>
+                    <a:srcRect/>
                     <a:stretch>
                       <a:fillRect/>
                     </a:stretch>
                   </pic:blipFill>
-                  <pic:spPr>
+                  <pic:spPr bwMode="auto">
                     <a:xfrm>
                       <a:off x="0" y="0"/>
-                      <a:ext cx="6472555" cy="5263515"/>
+                      <a:ext cx="6472555" cy="7863840"/>
                     </a:xfrm>
                     <a:prstGeom prst="rect">
                       <a:avLst/>
                     </a:prstGeom>
+                    <a:noFill/>
+                    <a:ln>
+                      <a:noFill/>
+                    </a:ln>
                   </pic:spPr>
                 </pic:pic>
               </a:graphicData>
@@ -1578,12 +1063,15 @@
         <w:br/>
       </w:r>
       <w:r>
+        <w:rPr>
+          <w:noProof/>
+        </w:rPr>
         <w:lastRenderedPageBreak/>
         <w:drawing>
-          <wp:inline distT="0" distB="0" distL="0" distR="0" wp14:anchorId="5B80EA92" wp14:editId="1D03882B">
-            <wp:extent cx="6472555" cy="5246370"/>
+          <wp:inline distT="0" distB="0" distL="0" distR="0" wp14:anchorId="7F5F6B7E" wp14:editId="68215188">
+            <wp:extent cx="6472555" cy="6897370"/>
             <wp:effectExtent l="0" t="0" r="4445" b="0"/>
-            <wp:docPr id="17471956" name="Imagem 1"/>
+            <wp:docPr id="4" name="Imagem 4"/>
             <wp:cNvGraphicFramePr>
               <a:graphicFrameLocks xmlns:a="http://schemas.openxmlformats.org/drawingml/2006/main" noChangeAspect="1"/>
             </wp:cNvGraphicFramePr>
@@ -1591,23 +1079,36 @@
               <a:graphicData uri="http://schemas.openxmlformats.org/drawingml/2006/picture">
                 <pic:pic xmlns:pic="http://schemas.openxmlformats.org/drawingml/2006/picture">
                   <pic:nvPicPr>
-                    <pic:cNvPr id="17471956" name=""/>
-                    <pic:cNvPicPr/>
+                    <pic:cNvPr id="0" name="Picture 5"/>
+                    <pic:cNvPicPr>
+                      <a:picLocks noChangeAspect="1" noChangeArrowheads="1"/>
+                    </pic:cNvPicPr>
                   </pic:nvPicPr>
                   <pic:blipFill>
-                    <a:blip r:embed="rId10"/>
+                    <a:blip r:embed="rId10" cstate="print">
+                      <a:extLst>
+                        <a:ext uri="{28A0092B-C50C-407E-A947-70E740481C1C}">
+                          <a14:useLocalDpi xmlns:a14="http://schemas.microsoft.com/office/drawing/2010/main" val="0"/>
+                        </a:ext>
+                      </a:extLst>
+                    </a:blip>
+                    <a:srcRect/>
                     <a:stretch>
                       <a:fillRect/>
                     </a:stretch>
                   </pic:blipFill>
-                  <pic:spPr>
+                  <pic:spPr bwMode="auto">
                     <a:xfrm>
                       <a:off x="0" y="0"/>
-                      <a:ext cx="6472555" cy="5246370"/>
+                      <a:ext cx="6472555" cy="6897370"/>
                     </a:xfrm>
                     <a:prstGeom prst="rect">
                       <a:avLst/>
                     </a:prstGeom>
+                    <a:noFill/>
+                    <a:ln>
+                      <a:noFill/>
+                    </a:ln>
                   </pic:spPr>
                 </pic:pic>
               </a:graphicData>
@@ -1619,12 +1120,15 @@
         <w:br/>
       </w:r>
       <w:r>
+        <w:rPr>
+          <w:noProof/>
+        </w:rPr>
         <w:lastRenderedPageBreak/>
         <w:drawing>
-          <wp:inline distT="0" distB="0" distL="0" distR="0" wp14:anchorId="67698CCC" wp14:editId="1DE44B79">
-            <wp:extent cx="6472555" cy="5249545"/>
-            <wp:effectExtent l="0" t="0" r="4445" b="8255"/>
-            <wp:docPr id="1254404122" name="Imagem 1"/>
+          <wp:inline distT="0" distB="0" distL="0" distR="0" wp14:anchorId="1FB11812" wp14:editId="2F83A36D">
+            <wp:extent cx="6472555" cy="4854575"/>
+            <wp:effectExtent l="0" t="0" r="4445" b="3175"/>
+            <wp:docPr id="5" name="Imagem 5"/>
             <wp:cNvGraphicFramePr>
               <a:graphicFrameLocks xmlns:a="http://schemas.openxmlformats.org/drawingml/2006/main" noChangeAspect="1"/>
             </wp:cNvGraphicFramePr>
@@ -1632,23 +1136,36 @@
               <a:graphicData uri="http://schemas.openxmlformats.org/drawingml/2006/picture">
                 <pic:pic xmlns:pic="http://schemas.openxmlformats.org/drawingml/2006/picture">
                   <pic:nvPicPr>
-                    <pic:cNvPr id="1254404122" name=""/>
-                    <pic:cNvPicPr/>
+                    <pic:cNvPr id="0" name="Picture 7"/>
+                    <pic:cNvPicPr>
+                      <a:picLocks noChangeAspect="1" noChangeArrowheads="1"/>
+                    </pic:cNvPicPr>
                   </pic:nvPicPr>
                   <pic:blipFill>
-                    <a:blip r:embed="rId11"/>
+                    <a:blip r:embed="rId11" cstate="print">
+                      <a:extLst>
+                        <a:ext uri="{28A0092B-C50C-407E-A947-70E740481C1C}">
+                          <a14:useLocalDpi xmlns:a14="http://schemas.microsoft.com/office/drawing/2010/main" val="0"/>
+                        </a:ext>
+                      </a:extLst>
+                    </a:blip>
+                    <a:srcRect/>
                     <a:stretch>
                       <a:fillRect/>
                     </a:stretch>
                   </pic:blipFill>
-                  <pic:spPr>
+                  <pic:spPr bwMode="auto">
                     <a:xfrm>
                       <a:off x="0" y="0"/>
-                      <a:ext cx="6472555" cy="5249545"/>
+                      <a:ext cx="6472555" cy="4854575"/>
                     </a:xfrm>
                     <a:prstGeom prst="rect">
                       <a:avLst/>
                     </a:prstGeom>
+                    <a:noFill/>
+                    <a:ln>
+                      <a:noFill/>
+                    </a:ln>
                   </pic:spPr>
                 </pic:pic>
               </a:graphicData>
@@ -1684,7 +1201,7 @@
 </file>
 
 <file path=word/endnotes.xml><?xml version="1.0" encoding="utf-8"?>
-<w:endnotes xmlns:wpc="http://schemas.microsoft.com/office/word/2010/wordprocessingCanvas" xmlns:cx="http://schemas.microsoft.com/office/drawing/2014/chartex" xmlns:cx1="http://schemas.microsoft.com/office/drawing/2015/9/8/chartex" xmlns:cx2="http://schemas.microsoft.com/office/drawing/2015/10/21/chartex" xmlns:cx3="http://schemas.microsoft.com/office/drawing/2016/5/9/chartex" xmlns:cx4="http://schemas.microsoft.com/office/drawing/2016/5/10/chartex" xmlns:cx5="http://schemas.microsoft.com/office/drawing/2016/5/11/chartex" xmlns:cx6="http://schemas.microsoft.com/office/drawing/2016/5/12/chartex" xmlns:cx7="http://schemas.microsoft.com/office/drawing/2016/5/13/chartex" xmlns:cx8="http://schemas.microsoft.com/office/drawing/2016/5/14/chartex" xmlns:mc="http://schemas.openxmlformats.org/markup-compatibility/2006" xmlns:aink="http://schemas.microsoft.com/office/drawing/2016/ink" xmlns:am3d="http://schemas.microsoft.com/office/drawing/2017/model3d" xmlns:o="urn:schemas-microsoft-com:office:office" xmlns:oel="http://schemas.microsoft.com/office/2019/extlst" xmlns:r="http://schemas.openxmlformats.org/officeDocument/2006/relationships" xmlns:m="http://schemas.openxmlformats.org/officeDocument/2006/math" xmlns:v="urn:schemas-microsoft-com:vml" xmlns:wp14="http://schemas.microsoft.com/office/word/2010/wordprocessingDrawing" xmlns:wp="http://schemas.openxmlformats.org/drawingml/2006/wordprocessingDrawing" xmlns:w10="urn:schemas-microsoft-com:office:word" xmlns:w="http://schemas.openxmlformats.org/wordprocessingml/2006/main" xmlns:w14="http://schemas.microsoft.com/office/word/2010/wordml" xmlns:w15="http://schemas.microsoft.com/office/word/2012/wordml" xmlns:w16cex="http://schemas.microsoft.com/office/word/2018/wordml/cex" xmlns:w16cid="http://schemas.microsoft.com/office/word/2016/wordml/cid" xmlns:w16="http://schemas.microsoft.com/office/word/2018/wordml" xmlns:w16du="http://schemas.microsoft.com/office/word/2023/wordml/word16du" xmlns:w16sdtdh="http://schemas.microsoft.com/office/word/2020/wordml/sdtdatahash" xmlns:w16sdtfl="http://schemas.microsoft.com/office/word/2024/wordml/sdtformatlock" xmlns:w16se="http://schemas.microsoft.com/office/word/2015/wordml/symex" xmlns:wpg="http://schemas.microsoft.com/office/word/2010/wordprocessingGroup" xmlns:wpi="http://schemas.microsoft.com/office/word/2010/wordprocessingInk" xmlns:wne="http://schemas.microsoft.com/office/word/2006/wordml" xmlns:wps="http://schemas.microsoft.com/office/word/2010/wordprocessingShape" mc:Ignorable="w14 w15 w16se w16cid w16 w16cex w16sdtdh w16sdtfl w16du wp14">
+<w:endnotes xmlns:wpc="http://schemas.microsoft.com/office/word/2010/wordprocessingCanvas" xmlns:cx="http://schemas.microsoft.com/office/drawing/2014/chartex" xmlns:cx1="http://schemas.microsoft.com/office/drawing/2015/9/8/chartex" xmlns:cx2="http://schemas.microsoft.com/office/drawing/2015/10/21/chartex" xmlns:cx3="http://schemas.microsoft.com/office/drawing/2016/5/9/chartex" xmlns:cx4="http://schemas.microsoft.com/office/drawing/2016/5/10/chartex" xmlns:cx5="http://schemas.microsoft.com/office/drawing/2016/5/11/chartex" xmlns:cx6="http://schemas.microsoft.com/office/drawing/2016/5/12/chartex" xmlns:cx7="http://schemas.microsoft.com/office/drawing/2016/5/13/chartex" xmlns:cx8="http://schemas.microsoft.com/office/drawing/2016/5/14/chartex" xmlns:mc="http://schemas.openxmlformats.org/markup-compatibility/2006" xmlns:aink="http://schemas.microsoft.com/office/drawing/2016/ink" xmlns:am3d="http://schemas.microsoft.com/office/drawing/2017/model3d" xmlns:o="urn:schemas-microsoft-com:office:office" xmlns:oel="http://schemas.microsoft.com/office/2019/extlst" xmlns:r="http://schemas.openxmlformats.org/officeDocument/2006/relationships" xmlns:m="http://schemas.openxmlformats.org/officeDocument/2006/math" xmlns:v="urn:schemas-microsoft-com:vml" xmlns:wp14="http://schemas.microsoft.com/office/word/2010/wordprocessingDrawing" xmlns:wp="http://schemas.openxmlformats.org/drawingml/2006/wordprocessingDrawing" xmlns:w10="urn:schemas-microsoft-com:office:word" xmlns:w="http://schemas.openxmlformats.org/wordprocessingml/2006/main" xmlns:w14="http://schemas.microsoft.com/office/word/2010/wordml" xmlns:w15="http://schemas.microsoft.com/office/word/2012/wordml" xmlns:w16cex="http://schemas.microsoft.com/office/word/2018/wordml/cex" xmlns:w16cid="http://schemas.microsoft.com/office/word/2016/wordml/cid" xmlns:w16="http://schemas.microsoft.com/office/word/2018/wordml" xmlns:w16sdtdh="http://schemas.microsoft.com/office/word/2020/wordml/sdtdatahash" xmlns:w16se="http://schemas.microsoft.com/office/word/2015/wordml/symex" xmlns:wpg="http://schemas.microsoft.com/office/word/2010/wordprocessingGroup" xmlns:wpi="http://schemas.microsoft.com/office/word/2010/wordprocessingInk" xmlns:wne="http://schemas.microsoft.com/office/word/2006/wordml" xmlns:wps="http://schemas.microsoft.com/office/word/2010/wordprocessingShape" mc:Ignorable="w14 w15 w16se w16cid w16 w16cex w16sdtdh wp14">
   <w:endnote w:type="separator" w:id="-1">
     <w:p>
       <w:pPr>
@@ -1709,7 +1226,7 @@
 </file>
 
 <file path=word/footnotes.xml><?xml version="1.0" encoding="utf-8"?>
-<w:footnotes xmlns:wpc="http://schemas.microsoft.com/office/word/2010/wordprocessingCanvas" xmlns:cx="http://schemas.microsoft.com/office/drawing/2014/chartex" xmlns:cx1="http://schemas.microsoft.com/office/drawing/2015/9/8/chartex" xmlns:cx2="http://schemas.microsoft.com/office/drawing/2015/10/21/chartex" xmlns:cx3="http://schemas.microsoft.com/office/drawing/2016/5/9/chartex" xmlns:cx4="http://schemas.microsoft.com/office/drawing/2016/5/10/chartex" xmlns:cx5="http://schemas.microsoft.com/office/drawing/2016/5/11/chartex" xmlns:cx6="http://schemas.microsoft.com/office/drawing/2016/5/12/chartex" xmlns:cx7="http://schemas.microsoft.com/office/drawing/2016/5/13/chartex" xmlns:cx8="http://schemas.microsoft.com/office/drawing/2016/5/14/chartex" xmlns:mc="http://schemas.openxmlformats.org/markup-compatibility/2006" xmlns:aink="http://schemas.microsoft.com/office/drawing/2016/ink" xmlns:am3d="http://schemas.microsoft.com/office/drawing/2017/model3d" xmlns:o="urn:schemas-microsoft-com:office:office" xmlns:oel="http://schemas.microsoft.com/office/2019/extlst" xmlns:r="http://schemas.openxmlformats.org/officeDocument/2006/relationships" xmlns:m="http://schemas.openxmlformats.org/officeDocument/2006/math" xmlns:v="urn:schemas-microsoft-com:vml" xmlns:wp14="http://schemas.microsoft.com/office/word/2010/wordprocessingDrawing" xmlns:wp="http://schemas.openxmlformats.org/drawingml/2006/wordprocessingDrawing" xmlns:w10="urn:schemas-microsoft-com:office:word" xmlns:w="http://schemas.openxmlformats.org/wordprocessingml/2006/main" xmlns:w14="http://schemas.microsoft.com/office/word/2010/wordml" xmlns:w15="http://schemas.microsoft.com/office/word/2012/wordml" xmlns:w16cex="http://schemas.microsoft.com/office/word/2018/wordml/cex" xmlns:w16cid="http://schemas.microsoft.com/office/word/2016/wordml/cid" xmlns:w16="http://schemas.microsoft.com/office/word/2018/wordml" xmlns:w16du="http://schemas.microsoft.com/office/word/2023/wordml/word16du" xmlns:w16sdtdh="http://schemas.microsoft.com/office/word/2020/wordml/sdtdatahash" xmlns:w16sdtfl="http://schemas.microsoft.com/office/word/2024/wordml/sdtformatlock" xmlns:w16se="http://schemas.microsoft.com/office/word/2015/wordml/symex" xmlns:wpg="http://schemas.microsoft.com/office/word/2010/wordprocessingGroup" xmlns:wpi="http://schemas.microsoft.com/office/word/2010/wordprocessingInk" xmlns:wne="http://schemas.microsoft.com/office/word/2006/wordml" xmlns:wps="http://schemas.microsoft.com/office/word/2010/wordprocessingShape" mc:Ignorable="w14 w15 w16se w16cid w16 w16cex w16sdtdh w16sdtfl w16du wp14">
+<w:footnotes xmlns:wpc="http://schemas.microsoft.com/office/word/2010/wordprocessingCanvas" xmlns:cx="http://schemas.microsoft.com/office/drawing/2014/chartex" xmlns:cx1="http://schemas.microsoft.com/office/drawing/2015/9/8/chartex" xmlns:cx2="http://schemas.microsoft.com/office/drawing/2015/10/21/chartex" xmlns:cx3="http://schemas.microsoft.com/office/drawing/2016/5/9/chartex" xmlns:cx4="http://schemas.microsoft.com/office/drawing/2016/5/10/chartex" xmlns:cx5="http://schemas.microsoft.com/office/drawing/2016/5/11/chartex" xmlns:cx6="http://schemas.microsoft.com/office/drawing/2016/5/12/chartex" xmlns:cx7="http://schemas.microsoft.com/office/drawing/2016/5/13/chartex" xmlns:cx8="http://schemas.microsoft.com/office/drawing/2016/5/14/chartex" xmlns:mc="http://schemas.openxmlformats.org/markup-compatibility/2006" xmlns:aink="http://schemas.microsoft.com/office/drawing/2016/ink" xmlns:am3d="http://schemas.microsoft.com/office/drawing/2017/model3d" xmlns:o="urn:schemas-microsoft-com:office:office" xmlns:oel="http://schemas.microsoft.com/office/2019/extlst" xmlns:r="http://schemas.openxmlformats.org/officeDocument/2006/relationships" xmlns:m="http://schemas.openxmlformats.org/officeDocument/2006/math" xmlns:v="urn:schemas-microsoft-com:vml" xmlns:wp14="http://schemas.microsoft.com/office/word/2010/wordprocessingDrawing" xmlns:wp="http://schemas.openxmlformats.org/drawingml/2006/wordprocessingDrawing" xmlns:w10="urn:schemas-microsoft-com:office:word" xmlns:w="http://schemas.openxmlformats.org/wordprocessingml/2006/main" xmlns:w14="http://schemas.microsoft.com/office/word/2010/wordml" xmlns:w15="http://schemas.microsoft.com/office/word/2012/wordml" xmlns:w16cex="http://schemas.microsoft.com/office/word/2018/wordml/cex" xmlns:w16cid="http://schemas.microsoft.com/office/word/2016/wordml/cid" xmlns:w16="http://schemas.microsoft.com/office/word/2018/wordml" xmlns:w16sdtdh="http://schemas.microsoft.com/office/word/2020/wordml/sdtdatahash" xmlns:w16se="http://schemas.microsoft.com/office/word/2015/wordml/symex" xmlns:wpg="http://schemas.microsoft.com/office/word/2010/wordprocessingGroup" xmlns:wpi="http://schemas.microsoft.com/office/word/2010/wordprocessingInk" xmlns:wne="http://schemas.microsoft.com/office/word/2006/wordml" xmlns:wps="http://schemas.microsoft.com/office/word/2010/wordprocessingShape" mc:Ignorable="w14 w15 w16se w16cid w16 w16cex w16sdtdh wp14">
   <w:footnote w:type="separator" w:id="-1">
     <w:p>
       <w:pPr>
@@ -1734,7 +1251,7 @@
 </file>
 
 <file path=word/numbering.xml><?xml version="1.0" encoding="utf-8"?>
-<w:numbering xmlns:wpc="http://schemas.microsoft.com/office/word/2010/wordprocessingCanvas" xmlns:cx="http://schemas.microsoft.com/office/drawing/2014/chartex" xmlns:cx1="http://schemas.microsoft.com/office/drawing/2015/9/8/chartex" xmlns:cx2="http://schemas.microsoft.com/office/drawing/2015/10/21/chartex" xmlns:cx3="http://schemas.microsoft.com/office/drawing/2016/5/9/chartex" xmlns:cx4="http://schemas.microsoft.com/office/drawing/2016/5/10/chartex" xmlns:cx5="http://schemas.microsoft.com/office/drawing/2016/5/11/chartex" xmlns:cx6="http://schemas.microsoft.com/office/drawing/2016/5/12/chartex" xmlns:cx7="http://schemas.microsoft.com/office/drawing/2016/5/13/chartex" xmlns:cx8="http://schemas.microsoft.com/office/drawing/2016/5/14/chartex" xmlns:mc="http://schemas.openxmlformats.org/markup-compatibility/2006" xmlns:aink="http://schemas.microsoft.com/office/drawing/2016/ink" xmlns:am3d="http://schemas.microsoft.com/office/drawing/2017/model3d" xmlns:o="urn:schemas-microsoft-com:office:office" xmlns:oel="http://schemas.microsoft.com/office/2019/extlst" xmlns:r="http://schemas.openxmlformats.org/officeDocument/2006/relationships" xmlns:m="http://schemas.openxmlformats.org/officeDocument/2006/math" xmlns:v="urn:schemas-microsoft-com:vml" xmlns:wp14="http://schemas.microsoft.com/office/word/2010/wordprocessingDrawing" xmlns:wp="http://schemas.openxmlformats.org/drawingml/2006/wordprocessingDrawing" xmlns:w10="urn:schemas-microsoft-com:office:word" xmlns:w="http://schemas.openxmlformats.org/wordprocessingml/2006/main" xmlns:w14="http://schemas.microsoft.com/office/word/2010/wordml" xmlns:w15="http://schemas.microsoft.com/office/word/2012/wordml" xmlns:w16cex="http://schemas.microsoft.com/office/word/2018/wordml/cex" xmlns:w16cid="http://schemas.microsoft.com/office/word/2016/wordml/cid" xmlns:w16="http://schemas.microsoft.com/office/word/2018/wordml" xmlns:w16du="http://schemas.microsoft.com/office/word/2023/wordml/word16du" xmlns:w16sdtdh="http://schemas.microsoft.com/office/word/2020/wordml/sdtdatahash" xmlns:w16sdtfl="http://schemas.microsoft.com/office/word/2024/wordml/sdtformatlock" xmlns:w16se="http://schemas.microsoft.com/office/word/2015/wordml/symex" xmlns:wpg="http://schemas.microsoft.com/office/word/2010/wordprocessingGroup" xmlns:wpi="http://schemas.microsoft.com/office/word/2010/wordprocessingInk" xmlns:wne="http://schemas.microsoft.com/office/word/2006/wordml" xmlns:wps="http://schemas.microsoft.com/office/word/2010/wordprocessingShape" mc:Ignorable="w14 w15 w16se w16cid w16 w16cex w16sdtdh w16sdtfl w16du wp14">
+<w:numbering xmlns:wpc="http://schemas.microsoft.com/office/word/2010/wordprocessingCanvas" xmlns:cx="http://schemas.microsoft.com/office/drawing/2014/chartex" xmlns:cx1="http://schemas.microsoft.com/office/drawing/2015/9/8/chartex" xmlns:cx2="http://schemas.microsoft.com/office/drawing/2015/10/21/chartex" xmlns:cx3="http://schemas.microsoft.com/office/drawing/2016/5/9/chartex" xmlns:cx4="http://schemas.microsoft.com/office/drawing/2016/5/10/chartex" xmlns:cx5="http://schemas.microsoft.com/office/drawing/2016/5/11/chartex" xmlns:cx6="http://schemas.microsoft.com/office/drawing/2016/5/12/chartex" xmlns:cx7="http://schemas.microsoft.com/office/drawing/2016/5/13/chartex" xmlns:cx8="http://schemas.microsoft.com/office/drawing/2016/5/14/chartex" xmlns:mc="http://schemas.openxmlformats.org/markup-compatibility/2006" xmlns:aink="http://schemas.microsoft.com/office/drawing/2016/ink" xmlns:am3d="http://schemas.microsoft.com/office/drawing/2017/model3d" xmlns:o="urn:schemas-microsoft-com:office:office" xmlns:oel="http://schemas.microsoft.com/office/2019/extlst" xmlns:r="http://schemas.openxmlformats.org/officeDocument/2006/relationships" xmlns:m="http://schemas.openxmlformats.org/officeDocument/2006/math" xmlns:v="urn:schemas-microsoft-com:vml" xmlns:wp14="http://schemas.microsoft.com/office/word/2010/wordprocessingDrawing" xmlns:wp="http://schemas.openxmlformats.org/drawingml/2006/wordprocessingDrawing" xmlns:w10="urn:schemas-microsoft-com:office:word" xmlns:w="http://schemas.openxmlformats.org/wordprocessingml/2006/main" xmlns:w14="http://schemas.microsoft.com/office/word/2010/wordml" xmlns:w15="http://schemas.microsoft.com/office/word/2012/wordml" xmlns:w16cex="http://schemas.microsoft.com/office/word/2018/wordml/cex" xmlns:w16cid="http://schemas.microsoft.com/office/word/2016/wordml/cid" xmlns:w16="http://schemas.microsoft.com/office/word/2018/wordml" xmlns:w16sdtdh="http://schemas.microsoft.com/office/word/2020/wordml/sdtdatahash" xmlns:w16se="http://schemas.microsoft.com/office/word/2015/wordml/symex" xmlns:wpg="http://schemas.microsoft.com/office/word/2010/wordprocessingGroup" xmlns:wpi="http://schemas.microsoft.com/office/word/2010/wordprocessingInk" xmlns:wne="http://schemas.microsoft.com/office/word/2006/wordml" xmlns:wps="http://schemas.microsoft.com/office/word/2010/wordprocessingShape" mc:Ignorable="w14 w15 w16se w16cid w16 w16cex w16sdtdh wp14">
   <w:abstractNum w:abstractNumId="0" w15:restartNumberingAfterBreak="0">
     <w:nsid w:val="0DDF46A5"/>
     <w:multiLevelType w:val="multilevel"/>
@@ -2043,7 +1560,7 @@
 </file>
 
 <file path=word/styles.xml><?xml version="1.0" encoding="utf-8"?>
-<w:styles xmlns:mc="http://schemas.openxmlformats.org/markup-compatibility/2006" xmlns:r="http://schemas.openxmlformats.org/officeDocument/2006/relationships" xmlns:w="http://schemas.openxmlformats.org/wordprocessingml/2006/main" xmlns:w14="http://schemas.microsoft.com/office/word/2010/wordml" xmlns:w15="http://schemas.microsoft.com/office/word/2012/wordml" xmlns:w16cex="http://schemas.microsoft.com/office/word/2018/wordml/cex" xmlns:w16cid="http://schemas.microsoft.com/office/word/2016/wordml/cid" xmlns:w16="http://schemas.microsoft.com/office/word/2018/wordml" xmlns:w16du="http://schemas.microsoft.com/office/word/2023/wordml/word16du" xmlns:w16sdtdh="http://schemas.microsoft.com/office/word/2020/wordml/sdtdatahash" xmlns:w16sdtfl="http://schemas.microsoft.com/office/word/2024/wordml/sdtformatlock" xmlns:w16se="http://schemas.microsoft.com/office/word/2015/wordml/symex" mc:Ignorable="w14 w15 w16se w16cid w16 w16cex w16sdtdh w16sdtfl w16du">
+<w:styles xmlns:mc="http://schemas.openxmlformats.org/markup-compatibility/2006" xmlns:r="http://schemas.openxmlformats.org/officeDocument/2006/relationships" xmlns:w="http://schemas.openxmlformats.org/wordprocessingml/2006/main" xmlns:w14="http://schemas.microsoft.com/office/word/2010/wordml" xmlns:w15="http://schemas.microsoft.com/office/word/2012/wordml" xmlns:w16cex="http://schemas.microsoft.com/office/word/2018/wordml/cex" xmlns:w16cid="http://schemas.microsoft.com/office/word/2016/wordml/cid" xmlns:w16="http://schemas.microsoft.com/office/word/2018/wordml" xmlns:w16sdtdh="http://schemas.microsoft.com/office/word/2020/wordml/sdtdatahash" xmlns:w16se="http://schemas.microsoft.com/office/word/2015/wordml/symex" mc:Ignorable="w14 w15 w16se w16cid w16 w16cex w16sdtdh">
   <w:docDefaults>
     <w:rPrDefault>
       <w:rPr>
@@ -2645,6 +2162,7 @@
   <w:style w:type="character" w:default="1" w:styleId="Fontepargpadro">
     <w:name w:val="Default Paragraph Font"/>
     <w:uiPriority w:val="1"/>
+    <w:semiHidden/>
     <w:unhideWhenUsed/>
   </w:style>
   <w:style w:type="table" w:default="1" w:styleId="Tabelanormal">

</xml_diff>